<commit_message>
SSD - Registrazione Utente
</commit_message>
<xml_diff>
--- a/CASI D'USO DETTAGLIATI RicorsivaMente.docx
+++ b/CASI D'USO DETTAGLIATI RicorsivaMente.docx
@@ -26,15 +26,15 @@
         <w:rPr>
           <w:b/>
           <w:bCs/>
-          <w:sz w:val="32"/>
-          <w:szCs w:val="32"/>
+          <w:sz w:val="40"/>
+          <w:szCs w:val="40"/>
         </w:rPr>
       </w:pPr>
       <w:r>
         <w:rPr>
           <w:rStyle w:val="Enfasigrassetto"/>
-          <w:sz w:val="32"/>
-          <w:szCs w:val="32"/>
+          <w:sz w:val="40"/>
+          <w:szCs w:val="40"/>
         </w:rPr>
         <w:t>1)</w:t>
       </w:r>
@@ -616,6 +616,7 @@
               <w:spacing w:beforeLines="20" w:before="48"/>
             </w:pPr>
             <w:r>
+              <w:lastRenderedPageBreak/>
               <w:t>Se ne è presente almeno una, la seleziona.</w:t>
             </w:r>
           </w:p>
@@ -629,7 +630,6 @@
               <w:spacing w:beforeLines="20" w:before="48"/>
             </w:pPr>
             <w:r>
-              <w:lastRenderedPageBreak/>
               <w:t>Contatta il Tour Operator per comunicargli eventuali richieste di cancellazione.</w:t>
             </w:r>
           </w:p>
@@ -922,8 +922,18 @@
     <w:p>
       <w:pPr>
         <w:spacing w:beforeLines="20" w:before="48"/>
+        <w:rPr>
+          <w:rStyle w:val="Enfasigrassetto"/>
+          <w:sz w:val="40"/>
+          <w:szCs w:val="40"/>
+        </w:rPr>
       </w:pPr>
       <w:r>
+        <w:rPr>
+          <w:rStyle w:val="Enfasigrassetto"/>
+          <w:sz w:val="40"/>
+          <w:szCs w:val="40"/>
+        </w:rPr>
         <w:lastRenderedPageBreak/>
         <w:t>2)</w:t>
       </w:r>
@@ -1622,8 +1632,18 @@
     <w:p>
       <w:pPr>
         <w:spacing w:beforeLines="20" w:before="48"/>
+        <w:rPr>
+          <w:rStyle w:val="Enfasigrassetto"/>
+          <w:sz w:val="40"/>
+          <w:szCs w:val="40"/>
+        </w:rPr>
       </w:pPr>
       <w:r>
+        <w:rPr>
+          <w:rStyle w:val="Enfasigrassetto"/>
+          <w:sz w:val="40"/>
+          <w:szCs w:val="40"/>
+        </w:rPr>
         <w:lastRenderedPageBreak/>
         <w:t>3)</w:t>
       </w:r>
@@ -2197,8 +2217,18 @@
     <w:p>
       <w:pPr>
         <w:spacing w:beforeLines="20" w:before="48"/>
+        <w:rPr>
+          <w:rStyle w:val="Enfasigrassetto"/>
+          <w:sz w:val="40"/>
+          <w:szCs w:val="40"/>
+        </w:rPr>
       </w:pPr>
       <w:r>
+        <w:rPr>
+          <w:rStyle w:val="Enfasigrassetto"/>
+          <w:sz w:val="40"/>
+          <w:szCs w:val="40"/>
+        </w:rPr>
         <w:t>4)</w:t>
       </w:r>
     </w:p>
@@ -2527,6 +2557,7 @@
                 <w:bCs/>
                 <w:color w:val="000000" w:themeColor="text1"/>
               </w:rPr>
+              <w:lastRenderedPageBreak/>
               <w:t>Scenario Principale di successo</w:t>
             </w:r>
           </w:p>
@@ -2568,7 +2599,6 @@
               <w:rPr>
                 <w:color w:val="000000" w:themeColor="text1"/>
               </w:rPr>
-              <w:lastRenderedPageBreak/>
               <w:t>L’amministratore seleziona il catalogo in cui selezionare il pacchetto</w:t>
             </w:r>
           </w:p>
@@ -2665,7 +2695,6 @@
                 <w:bCs/>
                 <w:color w:val="000000" w:themeColor="text1"/>
               </w:rPr>
-              <w:lastRenderedPageBreak/>
               <w:t>Estensioni</w:t>
             </w:r>
           </w:p>
@@ -2943,11 +2972,95 @@
           <w:u w:val="single"/>
         </w:rPr>
       </w:pPr>
-      <w:r>
+    </w:p>
+    <w:p>
+      <w:pPr>
         <w:rPr>
           <w:color w:val="000000" w:themeColor="text1"/>
           <w:u w:val="single"/>
         </w:rPr>
+      </w:pPr>
+    </w:p>
+    <w:p>
+      <w:pPr>
+        <w:rPr>
+          <w:color w:val="000000" w:themeColor="text1"/>
+          <w:u w:val="single"/>
+        </w:rPr>
+      </w:pPr>
+    </w:p>
+    <w:p>
+      <w:pPr>
+        <w:rPr>
+          <w:color w:val="000000" w:themeColor="text1"/>
+          <w:u w:val="single"/>
+        </w:rPr>
+      </w:pPr>
+    </w:p>
+    <w:p>
+      <w:pPr>
+        <w:rPr>
+          <w:color w:val="000000" w:themeColor="text1"/>
+          <w:u w:val="single"/>
+        </w:rPr>
+      </w:pPr>
+    </w:p>
+    <w:p>
+      <w:pPr>
+        <w:rPr>
+          <w:color w:val="000000" w:themeColor="text1"/>
+          <w:u w:val="single"/>
+        </w:rPr>
+      </w:pPr>
+    </w:p>
+    <w:p>
+      <w:pPr>
+        <w:rPr>
+          <w:color w:val="000000" w:themeColor="text1"/>
+          <w:u w:val="single"/>
+        </w:rPr>
+      </w:pPr>
+    </w:p>
+    <w:p>
+      <w:pPr>
+        <w:rPr>
+          <w:color w:val="000000" w:themeColor="text1"/>
+          <w:u w:val="single"/>
+        </w:rPr>
+      </w:pPr>
+    </w:p>
+    <w:p>
+      <w:pPr>
+        <w:rPr>
+          <w:color w:val="000000" w:themeColor="text1"/>
+          <w:u w:val="single"/>
+        </w:rPr>
+      </w:pPr>
+    </w:p>
+    <w:p>
+      <w:pPr>
+        <w:rPr>
+          <w:color w:val="000000" w:themeColor="text1"/>
+          <w:u w:val="single"/>
+        </w:rPr>
+      </w:pPr>
+    </w:p>
+    <w:p>
+      <w:pPr>
+        <w:spacing w:beforeLines="20" w:before="48"/>
+        <w:rPr>
+          <w:rStyle w:val="Enfasigrassetto"/>
+          <w:sz w:val="40"/>
+          <w:szCs w:val="40"/>
+        </w:rPr>
+      </w:pPr>
+      <w:r>
+        <w:rPr>
+          <w:rStyle w:val="Enfasigrassetto"/>
+          <w:sz w:val="40"/>
+          <w:szCs w:val="40"/>
+        </w:rPr>
+        <w:lastRenderedPageBreak/>
         <w:t>5)</w:t>
       </w:r>
     </w:p>
@@ -3353,7 +3466,6 @@
               <w:rPr>
                 <w:color w:val="000000" w:themeColor="text1"/>
               </w:rPr>
-              <w:lastRenderedPageBreak/>
               <w:t>L’amministratore seleziona “cancella pacchetto”</w:t>
             </w:r>
           </w:p>
@@ -3396,7 +3508,6 @@
                 <w:bCs/>
                 <w:color w:val="000000" w:themeColor="text1"/>
               </w:rPr>
-              <w:lastRenderedPageBreak/>
               <w:t>Estensioni</w:t>
             </w:r>
           </w:p>
@@ -3646,7 +3757,28 @@
       <w:pPr>
         <w:spacing w:beforeLines="20" w:before="48"/>
       </w:pPr>
+    </w:p>
+    <w:p>
+      <w:pPr>
+        <w:spacing w:beforeLines="20" w:before="48"/>
+      </w:pPr>
+    </w:p>
+    <w:p>
+      <w:pPr>
+        <w:spacing w:beforeLines="20" w:before="48"/>
+        <w:rPr>
+          <w:rStyle w:val="Enfasigrassetto"/>
+          <w:sz w:val="40"/>
+          <w:szCs w:val="40"/>
+        </w:rPr>
+      </w:pPr>
       <w:r>
+        <w:rPr>
+          <w:rStyle w:val="Enfasigrassetto"/>
+          <w:sz w:val="40"/>
+          <w:szCs w:val="40"/>
+        </w:rPr>
+        <w:lastRenderedPageBreak/>
         <w:t>6)</w:t>
       </w:r>
     </w:p>
@@ -3953,7 +4085,7 @@
               <w:pStyle w:val="Paragrafoelenco"/>
               <w:numPr>
                 <w:ilvl w:val="0"/>
-                <w:numId w:val="3"/>
+                <w:numId w:val="21"/>
               </w:numPr>
               <w:spacing w:beforeLines="20" w:before="48"/>
             </w:pPr>
@@ -3964,7 +4096,6 @@
           <w:p>
             <w:pPr>
               <w:spacing w:beforeLines="20" w:before="48"/>
-              <w:ind w:left="360"/>
             </w:pPr>
           </w:p>
           <w:p>
@@ -3972,12 +4103,11 @@
               <w:pStyle w:val="Paragrafoelenco"/>
               <w:numPr>
                 <w:ilvl w:val="0"/>
-                <w:numId w:val="3"/>
+                <w:numId w:val="21"/>
               </w:numPr>
               <w:spacing w:beforeLines="20" w:before="48"/>
             </w:pPr>
             <w:r>
-              <w:lastRenderedPageBreak/>
               <w:t>Il sistema mostra un modulo con i campi da compilare necessari per la registrazione.</w:t>
             </w:r>
           </w:p>
@@ -3991,10 +4121,9 @@
               <w:pStyle w:val="Paragrafoelenco"/>
               <w:numPr>
                 <w:ilvl w:val="0"/>
-                <w:numId w:val="3"/>
+                <w:numId w:val="21"/>
               </w:numPr>
               <w:spacing w:beforeLines="20" w:before="48"/>
-              <w:ind w:left="714" w:hanging="357"/>
             </w:pPr>
             <w:r>
               <w:t xml:space="preserve">L’utente compila tutti i campi obbligatori (contrassegnati da un asterisco) e sceglie se compilare anche quelli facoltativi. </w:t>
@@ -4162,7 +4291,11 @@
           <w:p>
             <w:pPr>
               <w:spacing w:beforeLines="20" w:before="48"/>
-              <w:ind w:left="737"/>
+            </w:pPr>
+          </w:p>
+          <w:p>
+            <w:pPr>
+              <w:spacing w:beforeLines="20" w:before="48"/>
             </w:pPr>
           </w:p>
           <w:p>
@@ -4170,19 +4303,8 @@
               <w:spacing w:beforeLines="20" w:before="48"/>
               <w:ind w:left="737"/>
             </w:pPr>
-          </w:p>
-          <w:p>
-            <w:pPr>
-              <w:spacing w:beforeLines="20" w:before="48"/>
-              <w:ind w:left="737"/>
-            </w:pPr>
-          </w:p>
-          <w:p>
-            <w:pPr>
-              <w:spacing w:beforeLines="20" w:before="48"/>
-              <w:ind w:left="737"/>
-            </w:pPr>
-            <w:r>
+            <w:r>
+              <w:lastRenderedPageBreak/>
               <w:t>Campi facoltativi:</w:t>
             </w:r>
           </w:p>
@@ -4203,57 +4325,6 @@
           </w:p>
           <w:p>
             <w:pPr>
-              <w:numPr>
-                <w:ilvl w:val="0"/>
-                <w:numId w:val="4"/>
-              </w:numPr>
-              <w:spacing w:beforeLines="20" w:before="48"/>
-            </w:pPr>
-            <w:r>
-              <w:t>Via;</w:t>
-            </w:r>
-          </w:p>
-          <w:p>
-            <w:pPr>
-              <w:numPr>
-                <w:ilvl w:val="0"/>
-                <w:numId w:val="4"/>
-              </w:numPr>
-              <w:spacing w:beforeLines="20" w:before="48"/>
-            </w:pPr>
-            <w:r>
-              <w:t>CAP;</w:t>
-            </w:r>
-          </w:p>
-          <w:p>
-            <w:pPr>
-              <w:numPr>
-                <w:ilvl w:val="0"/>
-                <w:numId w:val="4"/>
-              </w:numPr>
-              <w:spacing w:beforeLines="20" w:before="48"/>
-            </w:pPr>
-            <w:r>
-              <w:t>Provincia;</w:t>
-            </w:r>
-          </w:p>
-          <w:p>
-            <w:pPr>
-              <w:numPr>
-                <w:ilvl w:val="0"/>
-                <w:numId w:val="4"/>
-              </w:numPr>
-              <w:spacing w:beforeLines="20" w:before="48"/>
-            </w:pPr>
-            <w:r>
-              <w:t>Città</w:t>
-            </w:r>
-            <w:r>
-              <w:t>.</w:t>
-            </w:r>
-          </w:p>
-          <w:p>
-            <w:pPr>
               <w:spacing w:beforeLines="20" w:before="48"/>
             </w:pPr>
           </w:p>
@@ -4284,7 +4355,7 @@
               <w:pStyle w:val="Paragrafoelenco"/>
               <w:numPr>
                 <w:ilvl w:val="0"/>
-                <w:numId w:val="3"/>
+                <w:numId w:val="21"/>
               </w:numPr>
               <w:spacing w:beforeLines="20" w:before="48"/>
             </w:pPr>
@@ -4303,7 +4374,7 @@
               <w:pStyle w:val="Paragrafoelenco"/>
               <w:numPr>
                 <w:ilvl w:val="0"/>
-                <w:numId w:val="3"/>
+                <w:numId w:val="21"/>
               </w:numPr>
               <w:spacing w:beforeLines="20" w:before="48"/>
             </w:pPr>
@@ -4322,12 +4393,11 @@
               <w:pStyle w:val="Paragrafoelenco"/>
               <w:numPr>
                 <w:ilvl w:val="0"/>
-                <w:numId w:val="3"/>
+                <w:numId w:val="21"/>
               </w:numPr>
               <w:spacing w:beforeLines="20" w:before="48"/>
             </w:pPr>
             <w:r>
-              <w:lastRenderedPageBreak/>
               <w:t xml:space="preserve">L’utente conferma di aver terminato l’inserimento dei campi obbligatori, di aver accettato l’informativa sulla privacy e di aver espresso </w:t>
             </w:r>
             <w:r>
@@ -4353,7 +4423,7 @@
               <w:pStyle w:val="Paragrafoelenco"/>
               <w:numPr>
                 <w:ilvl w:val="0"/>
-                <w:numId w:val="3"/>
+                <w:numId w:val="21"/>
               </w:numPr>
               <w:spacing w:beforeLines="20" w:before="48"/>
             </w:pPr>
@@ -4524,6 +4594,7 @@
               <w:spacing w:beforeLines="20" w:before="48" w:after="160" w:line="278" w:lineRule="auto"/>
             </w:pPr>
             <w:r>
+              <w:lastRenderedPageBreak/>
               <w:t>Il sistema notifica la mancata visione e consenso dell’informativa sulla privacy</w:t>
             </w:r>
           </w:p>
@@ -4596,7 +4667,6 @@
               <w:spacing w:beforeLines="20" w:before="48" w:after="160" w:line="278" w:lineRule="auto"/>
             </w:pPr>
             <w:r>
-              <w:lastRenderedPageBreak/>
               <w:t>L’utente esprime le sue preferenze riguardo il consenso sul trattamento dei dati personali a scopi di marketing promozionale e il cedimento dei dati a parti terze. Si torna al punto 6.</w:t>
             </w:r>
           </w:p>
@@ -5440,6 +5510,95 @@
     </w:lvl>
   </w:abstractNum>
   <w:abstractNum w:abstractNumId="7" w15:restartNumberingAfterBreak="0">
+    <w:nsid w:val="3A091FE5"/>
+    <w:multiLevelType w:val="hybridMultilevel"/>
+    <w:tmpl w:val="B76E86A4"/>
+    <w:lvl w:ilvl="0" w:tplc="0410000F">
+      <w:start w:val="1"/>
+      <w:numFmt w:val="decimal"/>
+      <w:lvlText w:val="%1."/>
+      <w:lvlJc w:val="left"/>
+      <w:pPr>
+        <w:ind w:left="720" w:hanging="360"/>
+      </w:pPr>
+      <w:rPr>
+        <w:rFonts w:hint="default"/>
+      </w:rPr>
+    </w:lvl>
+    <w:lvl w:ilvl="1" w:tplc="04100019" w:tentative="1">
+      <w:start w:val="1"/>
+      <w:numFmt w:val="lowerLetter"/>
+      <w:lvlText w:val="%2."/>
+      <w:lvlJc w:val="left"/>
+      <w:pPr>
+        <w:ind w:left="1440" w:hanging="360"/>
+      </w:pPr>
+    </w:lvl>
+    <w:lvl w:ilvl="2" w:tplc="0410001B" w:tentative="1">
+      <w:start w:val="1"/>
+      <w:numFmt w:val="lowerRoman"/>
+      <w:lvlText w:val="%3."/>
+      <w:lvlJc w:val="right"/>
+      <w:pPr>
+        <w:ind w:left="2160" w:hanging="180"/>
+      </w:pPr>
+    </w:lvl>
+    <w:lvl w:ilvl="3" w:tplc="0410000F" w:tentative="1">
+      <w:start w:val="1"/>
+      <w:numFmt w:val="decimal"/>
+      <w:lvlText w:val="%4."/>
+      <w:lvlJc w:val="left"/>
+      <w:pPr>
+        <w:ind w:left="2880" w:hanging="360"/>
+      </w:pPr>
+    </w:lvl>
+    <w:lvl w:ilvl="4" w:tplc="04100019" w:tentative="1">
+      <w:start w:val="1"/>
+      <w:numFmt w:val="lowerLetter"/>
+      <w:lvlText w:val="%5."/>
+      <w:lvlJc w:val="left"/>
+      <w:pPr>
+        <w:ind w:left="3600" w:hanging="360"/>
+      </w:pPr>
+    </w:lvl>
+    <w:lvl w:ilvl="5" w:tplc="0410001B" w:tentative="1">
+      <w:start w:val="1"/>
+      <w:numFmt w:val="lowerRoman"/>
+      <w:lvlText w:val="%6."/>
+      <w:lvlJc w:val="right"/>
+      <w:pPr>
+        <w:ind w:left="4320" w:hanging="180"/>
+      </w:pPr>
+    </w:lvl>
+    <w:lvl w:ilvl="6" w:tplc="0410000F" w:tentative="1">
+      <w:start w:val="1"/>
+      <w:numFmt w:val="decimal"/>
+      <w:lvlText w:val="%7."/>
+      <w:lvlJc w:val="left"/>
+      <w:pPr>
+        <w:ind w:left="5040" w:hanging="360"/>
+      </w:pPr>
+    </w:lvl>
+    <w:lvl w:ilvl="7" w:tplc="04100019" w:tentative="1">
+      <w:start w:val="1"/>
+      <w:numFmt w:val="lowerLetter"/>
+      <w:lvlText w:val="%8."/>
+      <w:lvlJc w:val="left"/>
+      <w:pPr>
+        <w:ind w:left="5760" w:hanging="360"/>
+      </w:pPr>
+    </w:lvl>
+    <w:lvl w:ilvl="8" w:tplc="0410001B" w:tentative="1">
+      <w:start w:val="1"/>
+      <w:numFmt w:val="lowerRoman"/>
+      <w:lvlText w:val="%9."/>
+      <w:lvlJc w:val="right"/>
+      <w:pPr>
+        <w:ind w:left="6480" w:hanging="180"/>
+      </w:pPr>
+    </w:lvl>
+  </w:abstractNum>
+  <w:abstractNum w:abstractNumId="8" w15:restartNumberingAfterBreak="0">
     <w:nsid w:val="3AFE5821"/>
     <w:multiLevelType w:val="hybridMultilevel"/>
     <w:tmpl w:val="10503EF4"/>
@@ -5528,7 +5687,7 @@
       </w:pPr>
     </w:lvl>
   </w:abstractNum>
-  <w:abstractNum w:abstractNumId="8" w15:restartNumberingAfterBreak="0">
+  <w:abstractNum w:abstractNumId="9" w15:restartNumberingAfterBreak="0">
     <w:nsid w:val="3CD45248"/>
     <w:multiLevelType w:val="hybridMultilevel"/>
     <w:tmpl w:val="10503EF4"/>
@@ -5617,7 +5776,7 @@
       </w:pPr>
     </w:lvl>
   </w:abstractNum>
-  <w:abstractNum w:abstractNumId="9" w15:restartNumberingAfterBreak="0">
+  <w:abstractNum w:abstractNumId="10" w15:restartNumberingAfterBreak="0">
     <w:nsid w:val="42E87D86"/>
     <w:multiLevelType w:val="hybridMultilevel"/>
     <w:tmpl w:val="864EE966"/>
@@ -5703,7 +5862,7 @@
       </w:pPr>
     </w:lvl>
   </w:abstractNum>
-  <w:abstractNum w:abstractNumId="10" w15:restartNumberingAfterBreak="0">
+  <w:abstractNum w:abstractNumId="11" w15:restartNumberingAfterBreak="0">
     <w:nsid w:val="449F3AB4"/>
     <w:multiLevelType w:val="hybridMultilevel"/>
     <w:tmpl w:val="10503EF4"/>
@@ -5792,7 +5951,7 @@
       </w:pPr>
     </w:lvl>
   </w:abstractNum>
-  <w:abstractNum w:abstractNumId="11" w15:restartNumberingAfterBreak="0">
+  <w:abstractNum w:abstractNumId="12" w15:restartNumberingAfterBreak="0">
     <w:nsid w:val="44C8004B"/>
     <w:multiLevelType w:val="hybridMultilevel"/>
     <w:tmpl w:val="860C048C"/>
@@ -5881,7 +6040,7 @@
       </w:pPr>
     </w:lvl>
   </w:abstractNum>
-  <w:abstractNum w:abstractNumId="12" w15:restartNumberingAfterBreak="0">
+  <w:abstractNum w:abstractNumId="13" w15:restartNumberingAfterBreak="0">
     <w:nsid w:val="4EFD152E"/>
     <w:multiLevelType w:val="hybridMultilevel"/>
     <w:tmpl w:val="F3C2DA2A"/>
@@ -5970,7 +6129,7 @@
       </w:pPr>
     </w:lvl>
   </w:abstractNum>
-  <w:abstractNum w:abstractNumId="13" w15:restartNumberingAfterBreak="0">
+  <w:abstractNum w:abstractNumId="14" w15:restartNumberingAfterBreak="0">
     <w:nsid w:val="57E94A11"/>
     <w:multiLevelType w:val="hybridMultilevel"/>
     <w:tmpl w:val="6A76C638"/>
@@ -6056,7 +6215,7 @@
       </w:pPr>
     </w:lvl>
   </w:abstractNum>
-  <w:abstractNum w:abstractNumId="14" w15:restartNumberingAfterBreak="0">
+  <w:abstractNum w:abstractNumId="15" w15:restartNumberingAfterBreak="0">
     <w:nsid w:val="5FA21D75"/>
     <w:multiLevelType w:val="hybridMultilevel"/>
     <w:tmpl w:val="05748C7A"/>
@@ -6145,7 +6304,7 @@
       </w:pPr>
     </w:lvl>
   </w:abstractNum>
-  <w:abstractNum w:abstractNumId="15" w15:restartNumberingAfterBreak="0">
+  <w:abstractNum w:abstractNumId="16" w15:restartNumberingAfterBreak="0">
     <w:nsid w:val="64782D1B"/>
     <w:multiLevelType w:val="hybridMultilevel"/>
     <w:tmpl w:val="44CCAC66"/>
@@ -6231,7 +6390,7 @@
       </w:pPr>
     </w:lvl>
   </w:abstractNum>
-  <w:abstractNum w:abstractNumId="16" w15:restartNumberingAfterBreak="0">
+  <w:abstractNum w:abstractNumId="17" w15:restartNumberingAfterBreak="0">
     <w:nsid w:val="72D46F89"/>
     <w:multiLevelType w:val="hybridMultilevel"/>
     <w:tmpl w:val="B616ED0C"/>
@@ -6320,7 +6479,7 @@
       </w:pPr>
     </w:lvl>
   </w:abstractNum>
-  <w:abstractNum w:abstractNumId="17" w15:restartNumberingAfterBreak="0">
+  <w:abstractNum w:abstractNumId="18" w15:restartNumberingAfterBreak="0">
     <w:nsid w:val="74E13646"/>
     <w:multiLevelType w:val="hybridMultilevel"/>
     <w:tmpl w:val="05748C7A"/>
@@ -6409,7 +6568,7 @@
       </w:pPr>
     </w:lvl>
   </w:abstractNum>
-  <w:abstractNum w:abstractNumId="18" w15:restartNumberingAfterBreak="0">
+  <w:abstractNum w:abstractNumId="19" w15:restartNumberingAfterBreak="0">
     <w:nsid w:val="7CE64DF0"/>
     <w:multiLevelType w:val="hybridMultilevel"/>
     <w:tmpl w:val="6A76C638"/>
@@ -6495,7 +6654,7 @@
       </w:pPr>
     </w:lvl>
   </w:abstractNum>
-  <w:abstractNum w:abstractNumId="19" w15:restartNumberingAfterBreak="0">
+  <w:abstractNum w:abstractNumId="20" w15:restartNumberingAfterBreak="0">
     <w:nsid w:val="7D101680"/>
     <w:multiLevelType w:val="hybridMultilevel"/>
     <w:tmpl w:val="6A76C638"/>
@@ -6582,25 +6741,25 @@
     </w:lvl>
   </w:abstractNum>
   <w:num w:numId="1" w16cid:durableId="1323122613">
-    <w:abstractNumId w:val="9"/>
+    <w:abstractNumId w:val="10"/>
   </w:num>
   <w:num w:numId="2" w16cid:durableId="629091829">
-    <w:abstractNumId w:val="13"/>
+    <w:abstractNumId w:val="14"/>
   </w:num>
   <w:num w:numId="3" w16cid:durableId="925382111">
-    <w:abstractNumId w:val="15"/>
+    <w:abstractNumId w:val="16"/>
   </w:num>
   <w:num w:numId="4" w16cid:durableId="1141649647">
     <w:abstractNumId w:val="0"/>
   </w:num>
   <w:num w:numId="5" w16cid:durableId="1632786117">
+    <w:abstractNumId w:val="20"/>
+  </w:num>
+  <w:num w:numId="6" w16cid:durableId="1156872167">
     <w:abstractNumId w:val="19"/>
   </w:num>
-  <w:num w:numId="6" w16cid:durableId="1156872167">
-    <w:abstractNumId w:val="18"/>
-  </w:num>
   <w:num w:numId="7" w16cid:durableId="1173564923">
-    <w:abstractNumId w:val="11"/>
+    <w:abstractNumId w:val="12"/>
   </w:num>
   <w:num w:numId="8" w16cid:durableId="565410357">
     <w:abstractNumId w:val="5"/>
@@ -6612,7 +6771,7 @@
     <w:abstractNumId w:val="6"/>
   </w:num>
   <w:num w:numId="11" w16cid:durableId="276956199">
-    <w:abstractNumId w:val="16"/>
+    <w:abstractNumId w:val="17"/>
   </w:num>
   <w:num w:numId="12" w16cid:durableId="20665332">
     <w:abstractNumId w:val="2"/>
@@ -6621,25 +6780,28 @@
     <w:abstractNumId w:val="4"/>
   </w:num>
   <w:num w:numId="14" w16cid:durableId="157304589">
-    <w:abstractNumId w:val="12"/>
+    <w:abstractNumId w:val="13"/>
   </w:num>
   <w:num w:numId="15" w16cid:durableId="400518942">
     <w:abstractNumId w:val="3"/>
   </w:num>
   <w:num w:numId="16" w16cid:durableId="322706870">
-    <w:abstractNumId w:val="7"/>
+    <w:abstractNumId w:val="8"/>
   </w:num>
   <w:num w:numId="17" w16cid:durableId="708144051">
-    <w:abstractNumId w:val="17"/>
+    <w:abstractNumId w:val="18"/>
   </w:num>
   <w:num w:numId="18" w16cid:durableId="1272782870">
-    <w:abstractNumId w:val="8"/>
+    <w:abstractNumId w:val="9"/>
   </w:num>
   <w:num w:numId="19" w16cid:durableId="1180048352">
-    <w:abstractNumId w:val="10"/>
+    <w:abstractNumId w:val="11"/>
   </w:num>
   <w:num w:numId="20" w16cid:durableId="1007754404">
-    <w:abstractNumId w:val="14"/>
+    <w:abstractNumId w:val="15"/>
+  </w:num>
+  <w:num w:numId="21" w16cid:durableId="1374230641">
+    <w:abstractNumId w:val="7"/>
   </w:num>
 </w:numbering>
 </file>

</xml_diff>